<commit_message>
Replaced font in Projektantrag for better readability
</commit_message>
<xml_diff>
--- a/documentation/ProjektantragGearsOfBlood.docx
+++ b/documentation/ProjektantragGearsOfBlood.docx
@@ -5,7 +5,7 @@
     <w:p>
       <w:pPr>
         <w:rPr>
-          <w:rFonts w:ascii="Jacquard 12" w:hAnsi="Jacquard 12"/>
+          <w:rFonts w:ascii="OCR A Extended" w:hAnsi="OCR A Extended" w:cs="Centaur Now Display"/>
           <w:sz w:val="36"/>
           <w:szCs w:val="36"/>
           <w:lang w:val="de-DE"/>
@@ -13,7 +13,7 @@
       </w:pPr>
       <w:r>
         <w:rPr>
-          <w:rFonts w:ascii="Jacquard 12" w:hAnsi="Jacquard 12"/>
+          <w:rFonts w:ascii="OCR A Extended" w:hAnsi="OCR A Extended" w:cs="Centaur Now Display"/>
           <w:sz w:val="36"/>
           <w:szCs w:val="36"/>
           <w:lang w:val="de-DE"/>
@@ -22,7 +22,7 @@
       </w:r>
       <w:r>
         <w:rPr>
-          <w:rFonts w:ascii="Jacquard 12" w:hAnsi="Jacquard 12"/>
+          <w:rFonts w:ascii="OCR A Extended" w:hAnsi="OCR A Extended" w:cs="Centaur Now Display"/>
           <w:sz w:val="36"/>
           <w:szCs w:val="36"/>
           <w:lang w:val="de-DE"/>
@@ -32,7 +32,7 @@
       </w:r>
       <w:r>
         <w:rPr>
-          <w:rFonts w:ascii="Jacquard 12" w:hAnsi="Jacquard 12"/>
+          <w:rFonts w:ascii="OCR A Extended" w:hAnsi="OCR A Extended" w:cs="Centaur Now Display"/>
           <w:sz w:val="36"/>
           <w:szCs w:val="36"/>
           <w:lang w:val="de-DE"/>
@@ -41,7 +41,7 @@
       </w:r>
       <w:r>
         <w:rPr>
-          <w:rFonts w:ascii="Jacquard 12" w:hAnsi="Jacquard 12"/>
+          <w:rFonts w:ascii="OCR A Extended" w:hAnsi="OCR A Extended" w:cs="Centaur Now Display"/>
           <w:sz w:val="36"/>
           <w:szCs w:val="36"/>
           <w:lang w:val="de-DE"/>
@@ -52,7 +52,7 @@
     <w:p>
       <w:pPr>
         <w:rPr>
-          <w:rFonts w:ascii="Jacquard 12" w:hAnsi="Jacquard 12"/>
+          <w:rFonts w:ascii="OCR A Extended" w:hAnsi="OCR A Extended" w:cs="Centaur Now Display"/>
           <w:sz w:val="36"/>
           <w:szCs w:val="36"/>
           <w:lang w:val="de-DE"/>
@@ -60,7 +60,7 @@
       </w:pPr>
       <w:r>
         <w:rPr>
-          <w:rFonts w:ascii="Jacquard 12" w:hAnsi="Jacquard 12"/>
+          <w:rFonts w:ascii="OCR A Extended" w:hAnsi="OCR A Extended" w:cs="Centaur Now Display"/>
           <w:sz w:val="36"/>
           <w:szCs w:val="36"/>
           <w:lang w:val="de-DE"/>
@@ -71,15 +71,15 @@
     <w:p>
       <w:pPr>
         <w:rPr>
-          <w:rFonts w:ascii="Jacquard 12" w:hAnsi="Jacquard 12"/>
-          <w:lang w:val="de-DE"/>
-        </w:rPr>
-      </w:pPr>
-    </w:p>
-    <w:p>
-      <w:pPr>
-        <w:rPr>
-          <w:rFonts w:ascii="Jacquard 12" w:hAnsi="Jacquard 12"/>
+          <w:rFonts w:ascii="OCR A Extended" w:hAnsi="OCR A Extended" w:cs="Centaur Now Display"/>
+          <w:lang w:val="de-DE"/>
+        </w:rPr>
+      </w:pPr>
+    </w:p>
+    <w:p>
+      <w:pPr>
+        <w:rPr>
+          <w:rFonts w:ascii="OCR A Extended" w:hAnsi="OCR A Extended" w:cs="Centaur Now Display"/>
           <w:sz w:val="36"/>
           <w:szCs w:val="36"/>
           <w:lang w:val="de-DE"/>
@@ -87,7 +87,7 @@
       </w:pPr>
       <w:r>
         <w:rPr>
-          <w:rFonts w:ascii="Jacquard 12" w:hAnsi="Jacquard 12"/>
+          <w:rFonts w:ascii="OCR A Extended" w:hAnsi="OCR A Extended" w:cs="Centaur Now Display"/>
           <w:sz w:val="36"/>
           <w:szCs w:val="36"/>
           <w:lang w:val="de-DE"/>
@@ -98,48 +98,48 @@
     <w:p>
       <w:pPr>
         <w:rPr>
-          <w:rFonts w:ascii="Jacquard 12" w:hAnsi="Jacquard 12"/>
-          <w:lang w:val="de-DE"/>
-        </w:rPr>
-      </w:pPr>
-      <w:r>
-        <w:rPr>
-          <w:rFonts w:ascii="Jacquard 12" w:hAnsi="Jacquard 12"/>
+          <w:rFonts w:ascii="OCR A Extended" w:hAnsi="OCR A Extended" w:cs="Centaur Now Display"/>
+          <w:lang w:val="de-DE"/>
+        </w:rPr>
+      </w:pPr>
+      <w:r>
+        <w:rPr>
+          <w:rFonts w:ascii="OCR A Extended" w:hAnsi="OCR A Extended" w:cs="Centaur Now Display"/>
           <w:lang w:val="de-DE"/>
         </w:rPr>
         <w:t>„</w:t>
       </w:r>
       <w:r>
         <w:rPr>
-          <w:rFonts w:ascii="Jacquard 12" w:hAnsi="Jacquard 12"/>
+          <w:rFonts w:ascii="OCR A Extended" w:hAnsi="OCR A Extended" w:cs="Centaur Now Display"/>
           <w:lang w:val="de-DE"/>
         </w:rPr>
         <w:t>Gears of Blood</w:t>
       </w:r>
       <w:r>
         <w:rPr>
-          <w:rFonts w:ascii="Jacquard 12" w:hAnsi="Jacquard 12"/>
+          <w:rFonts w:ascii="OCR A Extended" w:hAnsi="OCR A Extended" w:cs="Centaur Now Display"/>
           <w:lang w:val="de-DE"/>
         </w:rPr>
         <w:t>“ wird ein Top-Down-Shooter, in den man mithilfe verschiedener Schusswaffen eine Horde an verschiedenen Steampunk-Zombies in einer Handvoll Level und einem endlo</w:t>
       </w:r>
       <w:r>
         <w:rPr>
-          <w:rFonts w:ascii="Jacquard 12" w:hAnsi="Jacquard 12"/>
+          <w:rFonts w:ascii="OCR A Extended" w:hAnsi="OCR A Extended" w:cs="Centaur Now Display"/>
           <w:lang w:val="de-DE"/>
         </w:rPr>
         <w:t>s</w:t>
       </w:r>
       <w:r>
         <w:rPr>
-          <w:rFonts w:ascii="Jacquard 12" w:hAnsi="Jacquard 12"/>
+          <w:rFonts w:ascii="OCR A Extended" w:hAnsi="OCR A Extended" w:cs="Centaur Now Display"/>
           <w:lang w:val="de-DE"/>
         </w:rPr>
         <w:t xml:space="preserve"> Modus besiegst. Am Ende jedes Levels gibt es einen Shop in dem man sich neue Waffen und Upgrades (extra Leben, schnellere Schüsse, mehr Schaden) mit Hilfe von Zahnrädern kaufen kann. Zahnräder bekommt man immer, wenn man Gegner tötet (mehr Zahnräder für stärkere Gegner).</w:t>
       </w:r>
       <w:r>
         <w:rPr>
-          <w:rFonts w:ascii="Jacquard 12" w:hAnsi="Jacquard 12"/>
+          <w:rFonts w:ascii="OCR A Extended" w:hAnsi="OCR A Extended" w:cs="Centaur Now Display"/>
           <w:lang w:val="de-DE"/>
         </w:rPr>
         <w:t xml:space="preserve"> Der Style des Games ist Steampunk gemixt mit 1970er Vintage.</w:t>
@@ -148,15 +148,15 @@
     <w:p>
       <w:pPr>
         <w:rPr>
-          <w:rFonts w:ascii="Jacquard 12" w:hAnsi="Jacquard 12"/>
-          <w:lang w:val="de-DE"/>
-        </w:rPr>
-      </w:pPr>
-    </w:p>
-    <w:p>
-      <w:pPr>
-        <w:rPr>
-          <w:rFonts w:ascii="Jacquard 12" w:hAnsi="Jacquard 12"/>
+          <w:rFonts w:ascii="OCR A Extended" w:hAnsi="OCR A Extended" w:cs="Centaur Now Display"/>
+          <w:lang w:val="de-DE"/>
+        </w:rPr>
+      </w:pPr>
+    </w:p>
+    <w:p>
+      <w:pPr>
+        <w:rPr>
+          <w:rFonts w:ascii="OCR A Extended" w:hAnsi="OCR A Extended" w:cs="Centaur Now Display"/>
           <w:sz w:val="36"/>
           <w:szCs w:val="36"/>
           <w:lang w:val="de-DE"/>
@@ -164,7 +164,7 @@
       </w:pPr>
       <w:r>
         <w:rPr>
-          <w:rFonts w:ascii="Jacquard 12" w:hAnsi="Jacquard 12"/>
+          <w:rFonts w:ascii="OCR A Extended" w:hAnsi="OCR A Extended" w:cs="Centaur Now Display"/>
           <w:sz w:val="36"/>
           <w:szCs w:val="36"/>
           <w:lang w:val="de-DE"/>
@@ -175,20 +175,20 @@
     <w:p>
       <w:pPr>
         <w:rPr>
-          <w:rFonts w:ascii="Jacquard 12" w:hAnsi="Jacquard 12"/>
-          <w:lang w:val="de-DE"/>
-        </w:rPr>
-      </w:pPr>
-      <w:r>
-        <w:rPr>
-          <w:rFonts w:ascii="Jacquard 12" w:hAnsi="Jacquard 12"/>
+          <w:rFonts w:ascii="OCR A Extended" w:hAnsi="OCR A Extended" w:cs="Centaur Now Display"/>
+          <w:lang w:val="de-DE"/>
+        </w:rPr>
+      </w:pPr>
+      <w:r>
+        <w:rPr>
+          <w:rFonts w:ascii="OCR A Extended" w:hAnsi="OCR A Extended" w:cs="Centaur Now Display"/>
           <w:lang w:val="de-DE"/>
         </w:rPr>
         <w:t>Es gibt verschiedene Mechankien um das Gameplay zu unterstützen. Man kann sliden, um keine Geschwindigkeit zu verlieren, oder Strafe Jumping (springen und dann vorwärts und entweder links oder rechts gedrückt halten) um Geschwindigkeit aufzubauen. Springen selbst kann man natürlich auch um nicht von Gegnern getroffen zu werden</w:t>
       </w:r>
       <w:r>
         <w:rPr>
-          <w:rFonts w:ascii="Jacquard 12" w:hAnsi="Jacquard 12"/>
+          <w:rFonts w:ascii="OCR A Extended" w:hAnsi="OCR A Extended" w:cs="Centaur Now Display"/>
           <w:lang w:val="de-DE"/>
         </w:rPr>
         <w:t xml:space="preserve">. Das Grundsätzliche movement versucht das movement von dem Spiel Dusk in eine 2D umgebung zu bringen. Die Level sind eher offen mit wenigen Gebäuden (außer das level spielt in einem Gebäude). Man kann nur 2 Waffen gleichzeitig tragen, hat aber die Option in einem Shop die aktuellen Waffen zu ersetzen. </w:t>
@@ -197,34 +197,34 @@
     <w:p>
       <w:pPr>
         <w:rPr>
-          <w:rFonts w:ascii="Jacquard 12" w:hAnsi="Jacquard 12"/>
-          <w:lang w:val="de-DE"/>
-        </w:rPr>
-      </w:pPr>
-      <w:r>
-        <w:rPr>
-          <w:rFonts w:ascii="Jacquard 12" w:hAnsi="Jacquard 12"/>
+          <w:rFonts w:ascii="OCR A Extended" w:hAnsi="OCR A Extended" w:cs="Centaur Now Display"/>
+          <w:lang w:val="de-DE"/>
+        </w:rPr>
+      </w:pPr>
+      <w:r>
+        <w:rPr>
+          <w:rFonts w:ascii="OCR A Extended" w:hAnsi="OCR A Extended" w:cs="Centaur Now Display"/>
           <w:lang w:val="de-DE"/>
         </w:rPr>
         <w:t>Man bewegt sich in „</w:t>
       </w:r>
       <w:r>
         <w:rPr>
-          <w:rFonts w:ascii="Jacquard 12" w:hAnsi="Jacquard 12"/>
+          <w:rFonts w:ascii="OCR A Extended" w:hAnsi="OCR A Extended" w:cs="Centaur Now Display"/>
           <w:lang w:val="de-DE"/>
         </w:rPr>
         <w:t>Gears of Blood</w:t>
       </w:r>
       <w:r>
         <w:rPr>
-          <w:rFonts w:ascii="Jacquard 12" w:hAnsi="Jacquard 12"/>
+          <w:rFonts w:ascii="OCR A Extended" w:hAnsi="OCR A Extended" w:cs="Centaur Now Display"/>
           <w:lang w:val="de-DE"/>
         </w:rPr>
         <w:t xml:space="preserve">“ mit W A S D, benutzt Space zum Springen, R zum </w:t>
       </w:r>
       <w:r>
         <w:rPr>
-          <w:rFonts w:ascii="Jacquard 12" w:hAnsi="Jacquard 12"/>
+          <w:rFonts w:ascii="OCR A Extended" w:hAnsi="OCR A Extended" w:cs="Centaur Now Display"/>
           <w:lang w:val="de-DE"/>
         </w:rPr>
         <w:t>Nachladen, Shift zum Sliden und Linker Mausknopf zum Schießen.</w:t>
@@ -233,13 +233,13 @@
     <w:p>
       <w:pPr>
         <w:rPr>
-          <w:rFonts w:ascii="Jacquard 12" w:hAnsi="Jacquard 12"/>
-          <w:lang w:val="de-DE"/>
-        </w:rPr>
-      </w:pPr>
-      <w:r>
-        <w:rPr>
-          <w:rFonts w:ascii="Jacquard 12" w:hAnsi="Jacquard 12"/>
+          <w:rFonts w:ascii="OCR A Extended" w:hAnsi="OCR A Extended" w:cs="Centaur Now Display"/>
+          <w:lang w:val="de-DE"/>
+        </w:rPr>
+      </w:pPr>
+      <w:r>
+        <w:rPr>
+          <w:rFonts w:ascii="OCR A Extended" w:hAnsi="OCR A Extended" w:cs="Centaur Now Display"/>
           <w:lang w:val="de-DE"/>
         </w:rPr>
         <w:t>Im Endlos modus kommen immer wieder Wellen auf einer größeren Map. Wenn eine Welle besiegt ist kann man sich neue Waffen und Upgrades kaufen und dann spawnt die Nächste, schwierigere Welle und so weiter und so fort.</w:t>
@@ -248,95 +248,95 @@
     <w:p>
       <w:pPr>
         <w:rPr>
-          <w:rFonts w:ascii="Jacquard 12" w:hAnsi="Jacquard 12"/>
-          <w:lang w:val="de-DE"/>
-        </w:rPr>
-      </w:pPr>
-    </w:p>
-    <w:p>
-      <w:pPr>
-        <w:rPr>
-          <w:rFonts w:ascii="Jacquard 12" w:hAnsi="Jacquard 12"/>
-          <w:lang w:val="de-DE"/>
-        </w:rPr>
-      </w:pPr>
-    </w:p>
-    <w:p>
-      <w:pPr>
-        <w:rPr>
-          <w:rFonts w:ascii="Jacquard 12" w:hAnsi="Jacquard 12"/>
-          <w:lang w:val="de-DE"/>
-        </w:rPr>
-      </w:pPr>
-    </w:p>
-    <w:p>
-      <w:pPr>
-        <w:rPr>
-          <w:rFonts w:ascii="Jacquard 12" w:hAnsi="Jacquard 12"/>
-          <w:lang w:val="de-DE"/>
-        </w:rPr>
-      </w:pPr>
-    </w:p>
-    <w:p>
-      <w:pPr>
-        <w:rPr>
-          <w:rFonts w:ascii="Jacquard 12" w:hAnsi="Jacquard 12"/>
-          <w:lang w:val="de-DE"/>
-        </w:rPr>
-      </w:pPr>
-    </w:p>
-    <w:p>
-      <w:pPr>
-        <w:rPr>
-          <w:rFonts w:ascii="Jacquard 12" w:hAnsi="Jacquard 12"/>
-          <w:lang w:val="de-DE"/>
-        </w:rPr>
-      </w:pPr>
-    </w:p>
-    <w:p>
-      <w:pPr>
-        <w:rPr>
-          <w:rFonts w:ascii="Jacquard 12" w:hAnsi="Jacquard 12"/>
-          <w:lang w:val="de-DE"/>
-        </w:rPr>
-      </w:pPr>
-    </w:p>
-    <w:p>
-      <w:pPr>
-        <w:rPr>
-          <w:rFonts w:ascii="Jacquard 12" w:hAnsi="Jacquard 12"/>
-          <w:lang w:val="de-DE"/>
-        </w:rPr>
-      </w:pPr>
-    </w:p>
-    <w:p>
-      <w:pPr>
-        <w:rPr>
-          <w:rFonts w:ascii="Jacquard 12" w:hAnsi="Jacquard 12"/>
-          <w:lang w:val="de-DE"/>
-        </w:rPr>
-      </w:pPr>
-    </w:p>
-    <w:p>
-      <w:pPr>
-        <w:rPr>
-          <w:rFonts w:ascii="Jacquard 12" w:hAnsi="Jacquard 12"/>
-          <w:lang w:val="de-DE"/>
-        </w:rPr>
-      </w:pPr>
-    </w:p>
-    <w:p>
-      <w:pPr>
-        <w:rPr>
-          <w:rFonts w:ascii="Jacquard 12" w:hAnsi="Jacquard 12"/>
-          <w:lang w:val="de-DE"/>
-        </w:rPr>
-      </w:pPr>
-    </w:p>
-    <w:p>
-      <w:pPr>
-        <w:rPr>
-          <w:rFonts w:ascii="Jacquard 12" w:hAnsi="Jacquard 12"/>
+          <w:rFonts w:ascii="OCR A Extended" w:hAnsi="OCR A Extended" w:cs="Centaur Now Display"/>
+          <w:lang w:val="de-DE"/>
+        </w:rPr>
+      </w:pPr>
+    </w:p>
+    <w:p>
+      <w:pPr>
+        <w:rPr>
+          <w:rFonts w:ascii="OCR A Extended" w:hAnsi="OCR A Extended" w:cs="Centaur Now Display"/>
+          <w:lang w:val="de-DE"/>
+        </w:rPr>
+      </w:pPr>
+    </w:p>
+    <w:p>
+      <w:pPr>
+        <w:rPr>
+          <w:rFonts w:ascii="OCR A Extended" w:hAnsi="OCR A Extended" w:cs="Centaur Now Display"/>
+          <w:lang w:val="de-DE"/>
+        </w:rPr>
+      </w:pPr>
+    </w:p>
+    <w:p>
+      <w:pPr>
+        <w:rPr>
+          <w:rFonts w:ascii="OCR A Extended" w:hAnsi="OCR A Extended" w:cs="Centaur Now Display"/>
+          <w:lang w:val="de-DE"/>
+        </w:rPr>
+      </w:pPr>
+    </w:p>
+    <w:p>
+      <w:pPr>
+        <w:rPr>
+          <w:rFonts w:ascii="OCR A Extended" w:hAnsi="OCR A Extended" w:cs="Centaur Now Display"/>
+          <w:lang w:val="de-DE"/>
+        </w:rPr>
+      </w:pPr>
+    </w:p>
+    <w:p>
+      <w:pPr>
+        <w:rPr>
+          <w:rFonts w:ascii="OCR A Extended" w:hAnsi="OCR A Extended" w:cs="Centaur Now Display"/>
+          <w:lang w:val="de-DE"/>
+        </w:rPr>
+      </w:pPr>
+    </w:p>
+    <w:p>
+      <w:pPr>
+        <w:rPr>
+          <w:rFonts w:ascii="OCR A Extended" w:hAnsi="OCR A Extended" w:cs="Centaur Now Display"/>
+          <w:lang w:val="de-DE"/>
+        </w:rPr>
+      </w:pPr>
+    </w:p>
+    <w:p>
+      <w:pPr>
+        <w:rPr>
+          <w:rFonts w:ascii="OCR A Extended" w:hAnsi="OCR A Extended" w:cs="Centaur Now Display"/>
+          <w:lang w:val="de-DE"/>
+        </w:rPr>
+      </w:pPr>
+    </w:p>
+    <w:p>
+      <w:pPr>
+        <w:rPr>
+          <w:rFonts w:ascii="OCR A Extended" w:hAnsi="OCR A Extended" w:cs="Centaur Now Display"/>
+          <w:lang w:val="de-DE"/>
+        </w:rPr>
+      </w:pPr>
+    </w:p>
+    <w:p>
+      <w:pPr>
+        <w:rPr>
+          <w:rFonts w:ascii="OCR A Extended" w:hAnsi="OCR A Extended" w:cs="Centaur Now Display"/>
+          <w:lang w:val="de-DE"/>
+        </w:rPr>
+      </w:pPr>
+    </w:p>
+    <w:p>
+      <w:pPr>
+        <w:rPr>
+          <w:rFonts w:ascii="OCR A Extended" w:hAnsi="OCR A Extended" w:cs="Centaur Now Display"/>
+          <w:lang w:val="de-DE"/>
+        </w:rPr>
+      </w:pPr>
+    </w:p>
+    <w:p>
+      <w:pPr>
+        <w:rPr>
+          <w:rFonts w:ascii="OCR A Extended" w:hAnsi="OCR A Extended" w:cs="Centaur Now Display"/>
           <w:sz w:val="36"/>
           <w:szCs w:val="36"/>
           <w:lang w:val="de-DE"/>
@@ -344,39 +344,38 @@
       </w:pPr>
       <w:r>
         <w:rPr>
-          <w:rFonts w:ascii="Jacquard 12" w:hAnsi="Jacquard 12"/>
+          <w:rFonts w:ascii="OCR A Extended" w:hAnsi="OCR A Extended" w:cs="Centaur Now Display"/>
           <w:sz w:val="36"/>
           <w:szCs w:val="36"/>
           <w:lang w:val="de-DE"/>
         </w:rPr>
-        <w:lastRenderedPageBreak/>
         <w:t>Zielgruppe</w:t>
       </w:r>
     </w:p>
     <w:p>
       <w:pPr>
         <w:rPr>
-          <w:rFonts w:ascii="Jacquard 12" w:hAnsi="Jacquard 12"/>
-          <w:lang w:val="de-DE"/>
-        </w:rPr>
-      </w:pPr>
-      <w:r>
-        <w:rPr>
-          <w:rFonts w:ascii="Jacquard 12" w:hAnsi="Jacquard 12"/>
+          <w:rFonts w:ascii="OCR A Extended" w:hAnsi="OCR A Extended" w:cs="Centaur Now Display"/>
+          <w:lang w:val="de-DE"/>
+        </w:rPr>
+      </w:pPr>
+      <w:r>
+        <w:rPr>
+          <w:rFonts w:ascii="OCR A Extended" w:hAnsi="OCR A Extended" w:cs="Centaur Now Display"/>
           <w:lang w:val="de-DE"/>
         </w:rPr>
         <w:t>Die Zielgruppe von „</w:t>
       </w:r>
       <w:r>
         <w:rPr>
-          <w:rFonts w:ascii="Jacquard 12" w:hAnsi="Jacquard 12"/>
+          <w:rFonts w:ascii="OCR A Extended" w:hAnsi="OCR A Extended" w:cs="Centaur Now Display"/>
           <w:lang w:val="de-DE"/>
         </w:rPr>
         <w:t>Gears of Blood</w:t>
       </w:r>
       <w:r>
         <w:rPr>
-          <w:rFonts w:ascii="Jacquard 12" w:hAnsi="Jacquard 12"/>
+          <w:rFonts w:ascii="OCR A Extended" w:hAnsi="OCR A Extended" w:cs="Centaur Now Display"/>
           <w:lang w:val="de-DE"/>
         </w:rPr>
         <w:t>“ sind Teenager im alter von 14+, welche fans von den Spielen Dusk, Hotline Miami und ähnlichen sind.</w:t>
@@ -385,15 +384,15 @@
     <w:p>
       <w:pPr>
         <w:rPr>
-          <w:rFonts w:ascii="Jacquard 12" w:hAnsi="Jacquard 12"/>
-          <w:lang w:val="de-DE"/>
-        </w:rPr>
-      </w:pPr>
-    </w:p>
-    <w:p>
-      <w:pPr>
-        <w:rPr>
-          <w:rFonts w:ascii="Jacquard 12" w:hAnsi="Jacquard 12"/>
+          <w:rFonts w:ascii="OCR A Extended" w:hAnsi="OCR A Extended" w:cs="Centaur Now Display"/>
+          <w:lang w:val="de-DE"/>
+        </w:rPr>
+      </w:pPr>
+    </w:p>
+    <w:p>
+      <w:pPr>
+        <w:rPr>
+          <w:rFonts w:ascii="OCR A Extended" w:hAnsi="OCR A Extended" w:cs="Centaur Now Display"/>
           <w:sz w:val="36"/>
           <w:szCs w:val="36"/>
           <w:lang w:val="de-DE"/>
@@ -401,7 +400,7 @@
       </w:pPr>
       <w:r>
         <w:rPr>
-          <w:rFonts w:ascii="Jacquard 12" w:hAnsi="Jacquard 12"/>
+          <w:rFonts w:ascii="OCR A Extended" w:hAnsi="OCR A Extended" w:cs="Centaur Now Display"/>
           <w:sz w:val="36"/>
           <w:szCs w:val="36"/>
           <w:lang w:val="de-DE"/>
@@ -412,34 +411,34 @@
     <w:p>
       <w:pPr>
         <w:rPr>
-          <w:rFonts w:ascii="Jacquard 12" w:hAnsi="Jacquard 12"/>
-          <w:lang w:val="de-DE"/>
-        </w:rPr>
-      </w:pPr>
-      <w:r>
-        <w:rPr>
-          <w:rFonts w:ascii="Jacquard 12" w:hAnsi="Jacquard 12"/>
+          <w:rFonts w:ascii="OCR A Extended" w:hAnsi="OCR A Extended" w:cs="Centaur Now Display"/>
+          <w:lang w:val="de-DE"/>
+        </w:rPr>
+      </w:pPr>
+      <w:r>
+        <w:rPr>
+          <w:rFonts w:ascii="OCR A Extended" w:hAnsi="OCR A Extended" w:cs="Centaur Now Display"/>
           <w:lang w:val="de-DE"/>
         </w:rPr>
         <w:t>Als erstes sollten die Hauptmechaniken wie Laufen und Springen gut funtkionieren, danach fokusiere ich mich auf die erste Map für das Testen von Features. Danach werden die ersten Waffen und Gegner hinzugefügt (simple AI). Das Nächste Feature ist der Endlos modus, welcher durch die vorhandenen Features schon gespielt wetden kann. Gleichzeitig werde ich an den Texturen</w:t>
       </w:r>
       <w:r>
         <w:rPr>
-          <w:rFonts w:ascii="Jacquard 12" w:hAnsi="Jacquard 12"/>
+          <w:rFonts w:ascii="OCR A Extended" w:hAnsi="OCR A Extended" w:cs="Centaur Now Display"/>
           <w:lang w:val="de-DE"/>
         </w:rPr>
         <w:t>,</w:t>
       </w:r>
       <w:r>
         <w:rPr>
-          <w:rFonts w:ascii="Jacquard 12" w:hAnsi="Jacquard 12"/>
+          <w:rFonts w:ascii="OCR A Extended" w:hAnsi="OCR A Extended" w:cs="Centaur Now Display"/>
           <w:lang w:val="de-DE"/>
         </w:rPr>
         <w:t xml:space="preserve"> dem Design der Website und den Assets </w:t>
       </w:r>
       <w:r>
         <w:rPr>
-          <w:rFonts w:ascii="Jacquard 12" w:hAnsi="Jacquard 12"/>
+          <w:rFonts w:ascii="OCR A Extended" w:hAnsi="OCR A Extended" w:cs="Centaur Now Display"/>
           <w:lang w:val="de-DE"/>
         </w:rPr>
         <w:t>zu Arbeiten (Pixel style). Die Nächsten Features sind das Upgraden und der Shop. Danach werden die aktuellen Mechaniken verbessert und optimisiert, damit alles für den Endlos modus vorhanden ist. Am schluss werde ich so viele Level wie mödlich erstellen, inklusiv einem Boss am schluss (Erstes Level welches erstellt wird, damit es auf jeden Fall fertig wird).</w:t>
@@ -448,7 +447,7 @@
     <w:p>
       <w:pPr>
         <w:rPr>
-          <w:rFonts w:ascii="Jacquard 12" w:hAnsi="Jacquard 12"/>
+          <w:rFonts w:ascii="OCR A Extended" w:hAnsi="OCR A Extended" w:cs="Centaur Now Display"/>
           <w:lang w:val="de-DE"/>
         </w:rPr>
       </w:pPr>

</xml_diff>

<commit_message>
Update project documentation with level design details and weapon mechanics
</commit_message>
<xml_diff>
--- a/documentation/ProjektantragGearsOfBlood.docx
+++ b/documentation/ProjektantragGearsOfBlood.docx
@@ -451,6 +451,689 @@
           <w:lang w:val="de-DE"/>
         </w:rPr>
       </w:pPr>
+    </w:p>
+    <w:p>
+      <w:pPr>
+        <w:rPr>
+          <w:rFonts w:ascii="OCR A Extended" w:hAnsi="OCR A Extended" w:cs="Centaur Now Display"/>
+          <w:sz w:val="36"/>
+          <w:szCs w:val="36"/>
+          <w:lang w:val="de-DE"/>
+        </w:rPr>
+      </w:pPr>
+      <w:r>
+        <w:rPr>
+          <w:rFonts w:ascii="OCR A Extended" w:hAnsi="OCR A Extended" w:cs="Centaur Now Display"/>
+          <w:sz w:val="36"/>
+          <w:szCs w:val="36"/>
+          <w:lang w:val="de-DE"/>
+        </w:rPr>
+        <w:t>Korrekturen/Erklärungen:</w:t>
+      </w:r>
+    </w:p>
+    <w:p>
+      <w:pPr>
+        <w:rPr>
+          <w:rFonts w:ascii="OCR A Extended" w:hAnsi="OCR A Extended" w:cs="Centaur Now Display"/>
+          <w:lang w:val="de-DE"/>
+        </w:rPr>
+      </w:pPr>
+      <w:r>
+        <w:rPr>
+          <w:rFonts w:ascii="OCR A Extended" w:hAnsi="OCR A Extended" w:cs="Centaur Now Display"/>
+          <w:lang w:val="de-DE"/>
+        </w:rPr>
+        <w:t xml:space="preserve">Ein Level in meinem Spiel ist eine größere eher lineare Karte, welche sich unter dem Spieler bewegt (Spieler bleibt statisch, nur die </w:t>
+      </w:r>
+      <w:proofErr w:type="spellStart"/>
+      <w:r>
+        <w:rPr>
+          <w:rFonts w:ascii="OCR A Extended" w:hAnsi="OCR A Extended" w:cs="Centaur Now Display"/>
+          <w:lang w:val="de-DE"/>
+        </w:rPr>
+        <w:t>Map</w:t>
+      </w:r>
+      <w:proofErr w:type="spellEnd"/>
+      <w:r>
+        <w:rPr>
+          <w:rFonts w:ascii="OCR A Extended" w:hAnsi="OCR A Extended" w:cs="Centaur Now Display"/>
+          <w:lang w:val="de-DE"/>
+        </w:rPr>
+        <w:t xml:space="preserve"> und Gegner bewegen sich)</w:t>
+      </w:r>
+    </w:p>
+    <w:p>
+      <w:pPr>
+        <w:rPr>
+          <w:rFonts w:ascii="OCR A Extended" w:hAnsi="OCR A Extended" w:cs="Centaur Now Display"/>
+          <w:lang w:val="de-DE"/>
+        </w:rPr>
+      </w:pPr>
+      <w:r>
+        <w:rPr>
+          <w:rFonts w:ascii="OCR A Extended" w:hAnsi="OCR A Extended" w:cs="Centaur Now Display"/>
+          <w:lang w:val="de-DE"/>
+        </w:rPr>
+        <w:t xml:space="preserve">Die verschiedenen Waffen, welche aktuell geplant sind währen: Pistole (schnellstes Movement, weniger Schaden), Maschinenpistole (normales Movement, vollautomatisch), </w:t>
+      </w:r>
+      <w:proofErr w:type="spellStart"/>
+      <w:r>
+        <w:rPr>
+          <w:rFonts w:ascii="OCR A Extended" w:hAnsi="OCR A Extended" w:cs="Centaur Now Display"/>
+          <w:lang w:val="de-DE"/>
+        </w:rPr>
+        <w:t>Schotgun</w:t>
+      </w:r>
+      <w:proofErr w:type="spellEnd"/>
+      <w:r>
+        <w:rPr>
+          <w:rFonts w:ascii="OCR A Extended" w:hAnsi="OCR A Extended" w:cs="Centaur Now Display"/>
+          <w:lang w:val="de-DE"/>
+        </w:rPr>
+        <w:t xml:space="preserve"> (normales Movement, verschießt mehrere Pellets, welche alle wenig schaden machen (je näher umso mehr Pellets treffen -&gt; mehr schaden)), Granade Launcher (Langsames Movement, verschießt Granaten welche explodieren und alles in </w:t>
+      </w:r>
+      <w:r>
+        <w:rPr>
+          <w:rFonts w:ascii="OCR A Extended" w:hAnsi="OCR A Extended" w:cs="Centaur Now Display"/>
+          <w:lang w:val="de-DE"/>
+        </w:rPr>
+        <w:lastRenderedPageBreak/>
+        <w:t xml:space="preserve">einem gewissen Radius Schaden zufügt), Sniper (Langsames Movement, Höchster Schaden + </w:t>
+      </w:r>
+      <w:proofErr w:type="spellStart"/>
+      <w:r>
+        <w:rPr>
+          <w:rFonts w:ascii="OCR A Extended" w:hAnsi="OCR A Extended" w:cs="Centaur Now Display"/>
+          <w:lang w:val="de-DE"/>
+        </w:rPr>
+        <w:t>Bullets</w:t>
+      </w:r>
+      <w:proofErr w:type="spellEnd"/>
+      <w:r>
+        <w:rPr>
+          <w:rFonts w:ascii="OCR A Extended" w:hAnsi="OCR A Extended" w:cs="Centaur Now Display"/>
+          <w:lang w:val="de-DE"/>
+        </w:rPr>
+        <w:t xml:space="preserve"> können Gegner penetrieren und dadurch auch Gegner dahinter treffen)</w:t>
+      </w:r>
+    </w:p>
+    <w:p>
+      <w:pPr>
+        <w:rPr>
+          <w:rFonts w:ascii="OCR A Extended" w:hAnsi="OCR A Extended" w:cs="Centaur Now Display"/>
+          <w:lang w:val="de-DE"/>
+        </w:rPr>
+      </w:pPr>
+    </w:p>
+    <w:p>
+      <w:pPr>
+        <w:rPr>
+          <w:rFonts w:ascii="OCR A Extended" w:hAnsi="OCR A Extended" w:cs="Centaur Now Display"/>
+          <w:lang w:val="de-DE"/>
+        </w:rPr>
+      </w:pPr>
+      <w:r>
+        <w:rPr>
+          <w:rFonts w:ascii="OCR A Extended" w:hAnsi="OCR A Extended" w:cs="Centaur Now Display"/>
+          <w:lang w:val="de-DE"/>
+        </w:rPr>
+        <w:t xml:space="preserve">Das Besondere am Movement ist das es das Movement von Spielen wie </w:t>
+      </w:r>
+      <w:proofErr w:type="gramStart"/>
+      <w:r>
+        <w:rPr>
+          <w:rFonts w:ascii="OCR A Extended" w:hAnsi="OCR A Extended" w:cs="Centaur Now Display"/>
+          <w:lang w:val="de-DE"/>
+        </w:rPr>
+        <w:t>Quake</w:t>
+      </w:r>
+      <w:proofErr w:type="gramEnd"/>
+      <w:r>
+        <w:rPr>
+          <w:rFonts w:ascii="OCR A Extended" w:hAnsi="OCR A Extended" w:cs="Centaur Now Display"/>
+          <w:lang w:val="de-DE"/>
+        </w:rPr>
+        <w:t xml:space="preserve">, Half </w:t>
+      </w:r>
+      <w:proofErr w:type="spellStart"/>
+      <w:r>
+        <w:rPr>
+          <w:rFonts w:ascii="OCR A Extended" w:hAnsi="OCR A Extended" w:cs="Centaur Now Display"/>
+          <w:lang w:val="de-DE"/>
+        </w:rPr>
+        <w:t>life</w:t>
+      </w:r>
+      <w:proofErr w:type="spellEnd"/>
+      <w:r>
+        <w:rPr>
+          <w:rFonts w:ascii="OCR A Extended" w:hAnsi="OCR A Extended" w:cs="Centaur Now Display"/>
+          <w:lang w:val="de-DE"/>
+        </w:rPr>
+        <w:t xml:space="preserve"> oder ähnlichen nimmt und es dann in eine 2D Umgebung übertragen. (</w:t>
+      </w:r>
+      <w:proofErr w:type="gramStart"/>
+      <w:r>
+        <w:rPr>
+          <w:rFonts w:ascii="OCR A Extended" w:hAnsi="OCR A Extended" w:cs="Centaur Now Display"/>
+          <w:lang w:val="de-DE"/>
+        </w:rPr>
+        <w:t>Hier</w:t>
+      </w:r>
+      <w:proofErr w:type="gramEnd"/>
+      <w:r>
+        <w:rPr>
+          <w:rFonts w:ascii="OCR A Extended" w:hAnsi="OCR A Extended" w:cs="Centaur Now Display"/>
+          <w:lang w:val="de-DE"/>
+        </w:rPr>
+        <w:t xml:space="preserve"> ist ein </w:t>
+      </w:r>
+      <w:r>
+        <w:rPr>
+          <w:rFonts w:ascii="OCR A Extended" w:hAnsi="OCR A Extended" w:cs="Centaur Now Display"/>
+          <w:lang w:val="de-DE"/>
+        </w:rPr>
+        <w:t>Video,</w:t>
+      </w:r>
+      <w:r>
+        <w:rPr>
+          <w:rFonts w:ascii="OCR A Extended" w:hAnsi="OCR A Extended" w:cs="Centaur Now Display"/>
+          <w:lang w:val="de-DE"/>
+        </w:rPr>
+        <w:t xml:space="preserve"> welches das Movement dieser Spiele und ihre Besonderheiten gut erklärt:</w:t>
+      </w:r>
+      <w:r>
+        <w:rPr>
+          <w:rFonts w:ascii="OCR A Extended" w:hAnsi="OCR A Extended" w:cs="Centaur Now Display"/>
+          <w:lang w:val="de-DE"/>
+        </w:rPr>
+        <w:br/>
+      </w:r>
+      <w:hyperlink r:id="rId4" w:history="1">
+        <w:r>
+          <w:rPr>
+            <w:rStyle w:val="Hyperlink"/>
+            <w:rFonts w:ascii="OCR A Extended" w:hAnsi="OCR A Extended" w:cs="Centaur Now Display"/>
+            <w:lang w:val="de-DE"/>
+          </w:rPr>
+          <w:t>https://www.youtube.com/watch?v=gRqoXy-0d84&amp;t=121s</w:t>
+        </w:r>
+      </w:hyperlink>
+      <w:r>
+        <w:rPr>
+          <w:rFonts w:ascii="OCR A Extended" w:hAnsi="OCR A Extended" w:cs="Centaur Now Display"/>
+          <w:lang w:val="de-DE"/>
+        </w:rPr>
+        <w:t>)</w:t>
+      </w:r>
+    </w:p>
+    <w:p>
+      <w:pPr>
+        <w:rPr>
+          <w:rFonts w:ascii="OCR A Extended" w:hAnsi="OCR A Extended" w:cs="Centaur Now Display"/>
+          <w:lang w:val="de-DE"/>
+        </w:rPr>
+      </w:pPr>
+    </w:p>
+    <w:p>
+      <w:pPr>
+        <w:rPr>
+          <w:rFonts w:ascii="OCR A Extended" w:hAnsi="OCR A Extended" w:cs="Centaur Now Display"/>
+          <w:lang w:val="de-DE"/>
+        </w:rPr>
+      </w:pPr>
+      <w:r>
+        <w:rPr>
+          <w:rFonts w:ascii="OCR A Extended" w:hAnsi="OCR A Extended" w:cs="Centaur Now Display"/>
+          <w:lang w:val="de-DE"/>
+        </w:rPr>
+        <w:t xml:space="preserve">Ich werde für jede Waffe einen Sprite </w:t>
+      </w:r>
+      <w:proofErr w:type="spellStart"/>
+      <w:r>
+        <w:rPr>
+          <w:rFonts w:ascii="OCR A Extended" w:hAnsi="OCR A Extended" w:cs="Centaur Now Display"/>
+          <w:lang w:val="de-DE"/>
+        </w:rPr>
+        <w:t>pixeln</w:t>
+      </w:r>
+      <w:proofErr w:type="spellEnd"/>
+      <w:r>
+        <w:rPr>
+          <w:rFonts w:ascii="OCR A Extended" w:hAnsi="OCR A Extended" w:cs="Centaur Now Display"/>
+          <w:lang w:val="de-DE"/>
+        </w:rPr>
+        <w:t xml:space="preserve"> für, wenn sie vom Spieler gehalten wird und als Item (mit Farbe und Schwarz-weiß). Hier sind die Aktuellen Sprites für die Pistole:</w:t>
+      </w:r>
+    </w:p>
+    <w:p>
+      <w:pPr>
+        <w:rPr>
+          <w:rFonts w:ascii="OCR A Extended" w:hAnsi="OCR A Extended" w:cs="Centaur Now Display"/>
+          <w:lang w:val="de-DE"/>
+        </w:rPr>
+      </w:pPr>
+      <w:r>
+        <w:rPr>
+          <w:rFonts w:ascii="OCR A Extended" w:hAnsi="OCR A Extended" w:cs="Centaur Now Display"/>
+          <w:noProof/>
+          <w:lang w:val="de-DE"/>
+        </w:rPr>
+        <w:drawing>
+          <wp:inline distT="0" distB="0" distL="0" distR="0" wp14:anchorId="34B9FF21" wp14:editId="0F3F5037">
+            <wp:extent cx="611505" cy="302895"/>
+            <wp:effectExtent l="0" t="0" r="0" b="1905"/>
+            <wp:docPr id="2012065096" name="Grafik 1"/>
+            <wp:cNvGraphicFramePr>
+              <a:graphicFrameLocks xmlns:a="http://schemas.openxmlformats.org/drawingml/2006/main" noChangeAspect="1"/>
+            </wp:cNvGraphicFramePr>
+            <a:graphic xmlns:a="http://schemas.openxmlformats.org/drawingml/2006/main">
+              <a:graphicData uri="http://schemas.openxmlformats.org/drawingml/2006/picture">
+                <pic:pic xmlns:pic="http://schemas.openxmlformats.org/drawingml/2006/picture">
+                  <pic:nvPicPr>
+                    <pic:cNvPr id="0" name="Picture 1"/>
+                    <pic:cNvPicPr>
+                      <a:picLocks noChangeAspect="1" noChangeArrowheads="1"/>
+                    </pic:cNvPicPr>
+                  </pic:nvPicPr>
+                  <pic:blipFill>
+                    <a:blip r:embed="rId5">
+                      <a:extLst>
+                        <a:ext uri="{28A0092B-C50C-407E-A947-70E740481C1C}">
+                          <a14:useLocalDpi xmlns:a14="http://schemas.microsoft.com/office/drawing/2010/main" val="0"/>
+                        </a:ext>
+                      </a:extLst>
+                    </a:blip>
+                    <a:srcRect/>
+                    <a:stretch>
+                      <a:fillRect/>
+                    </a:stretch>
+                  </pic:blipFill>
+                  <pic:spPr bwMode="auto">
+                    <a:xfrm>
+                      <a:off x="0" y="0"/>
+                      <a:ext cx="611505" cy="302895"/>
+                    </a:xfrm>
+                    <a:prstGeom prst="rect">
+                      <a:avLst/>
+                    </a:prstGeom>
+                    <a:noFill/>
+                    <a:ln>
+                      <a:noFill/>
+                    </a:ln>
+                  </pic:spPr>
+                </pic:pic>
+              </a:graphicData>
+            </a:graphic>
+          </wp:inline>
+        </w:drawing>
+      </w:r>
+      <w:r>
+        <w:rPr>
+          <w:rFonts w:ascii="OCR A Extended" w:hAnsi="OCR A Extended" w:cs="Centaur Now Display"/>
+          <w:noProof/>
+          <w:lang w:val="de-DE"/>
+        </w:rPr>
+        <w:drawing>
+          <wp:inline distT="0" distB="0" distL="0" distR="0" wp14:anchorId="66DCF22C" wp14:editId="1E818260">
+            <wp:extent cx="302895" cy="302895"/>
+            <wp:effectExtent l="0" t="0" r="1905" b="1905"/>
+            <wp:docPr id="1933645908" name="Grafik 2"/>
+            <wp:cNvGraphicFramePr>
+              <a:graphicFrameLocks xmlns:a="http://schemas.openxmlformats.org/drawingml/2006/main" noChangeAspect="1"/>
+            </wp:cNvGraphicFramePr>
+            <a:graphic xmlns:a="http://schemas.openxmlformats.org/drawingml/2006/main">
+              <a:graphicData uri="http://schemas.openxmlformats.org/drawingml/2006/picture">
+                <pic:pic xmlns:pic="http://schemas.openxmlformats.org/drawingml/2006/picture">
+                  <pic:nvPicPr>
+                    <pic:cNvPr id="0" name="Picture 2"/>
+                    <pic:cNvPicPr>
+                      <a:picLocks noChangeAspect="1" noChangeArrowheads="1"/>
+                    </pic:cNvPicPr>
+                  </pic:nvPicPr>
+                  <pic:blipFill>
+                    <a:blip r:embed="rId6">
+                      <a:extLst>
+                        <a:ext uri="{28A0092B-C50C-407E-A947-70E740481C1C}">
+                          <a14:useLocalDpi xmlns:a14="http://schemas.microsoft.com/office/drawing/2010/main" val="0"/>
+                        </a:ext>
+                      </a:extLst>
+                    </a:blip>
+                    <a:srcRect/>
+                    <a:stretch>
+                      <a:fillRect/>
+                    </a:stretch>
+                  </pic:blipFill>
+                  <pic:spPr bwMode="auto">
+                    <a:xfrm>
+                      <a:off x="0" y="0"/>
+                      <a:ext cx="302895" cy="302895"/>
+                    </a:xfrm>
+                    <a:prstGeom prst="rect">
+                      <a:avLst/>
+                    </a:prstGeom>
+                    <a:noFill/>
+                    <a:ln>
+                      <a:noFill/>
+                    </a:ln>
+                  </pic:spPr>
+                </pic:pic>
+              </a:graphicData>
+            </a:graphic>
+          </wp:inline>
+        </w:drawing>
+      </w:r>
+    </w:p>
+    <w:p>
+      <w:pPr>
+        <w:rPr>
+          <w:rFonts w:ascii="OCR A Extended" w:hAnsi="OCR A Extended" w:cs="Centaur Now Display"/>
+          <w:lang w:val="de-DE"/>
+        </w:rPr>
+      </w:pPr>
+    </w:p>
+    <w:p>
+      <w:pPr>
+        <w:rPr>
+          <w:rFonts w:ascii="OCR A Extended" w:hAnsi="OCR A Extended" w:cs="Centaur Now Display"/>
+          <w:sz w:val="36"/>
+          <w:szCs w:val="36"/>
+          <w:lang w:val="de-DE"/>
+        </w:rPr>
+      </w:pPr>
+      <w:r>
+        <w:rPr>
+          <w:rFonts w:ascii="OCR A Extended" w:hAnsi="OCR A Extended" w:cs="Centaur Now Display"/>
+          <w:sz w:val="36"/>
+          <w:szCs w:val="36"/>
+          <w:lang w:val="de-DE"/>
+        </w:rPr>
+        <w:t>Mood Bilder:</w:t>
+      </w:r>
+    </w:p>
+    <w:p>
+      <w:pPr>
+        <w:rPr>
+          <w:rFonts w:ascii="OCR A Extended" w:hAnsi="OCR A Extended" w:cs="Centaur Now Display"/>
+          <w:sz w:val="36"/>
+          <w:szCs w:val="36"/>
+          <w:lang w:val="de-DE"/>
+        </w:rPr>
+      </w:pPr>
+      <w:r>
+        <w:rPr>
+          <w:noProof/>
+        </w:rPr>
+        <w:drawing>
+          <wp:inline distT="0" distB="0" distL="0" distR="0" wp14:anchorId="52C4C687" wp14:editId="5534BE2D">
+            <wp:extent cx="1443866" cy="2631003"/>
+            <wp:effectExtent l="0" t="0" r="4445" b="0"/>
+            <wp:docPr id="18735496" name="Grafik 3" descr="Han Park - Steampunk Zombie"/>
+            <wp:cNvGraphicFramePr>
+              <a:graphicFrameLocks xmlns:a="http://schemas.openxmlformats.org/drawingml/2006/main" noChangeAspect="1"/>
+            </wp:cNvGraphicFramePr>
+            <a:graphic xmlns:a="http://schemas.openxmlformats.org/drawingml/2006/main">
+              <a:graphicData uri="http://schemas.openxmlformats.org/drawingml/2006/picture">
+                <pic:pic xmlns:pic="http://schemas.openxmlformats.org/drawingml/2006/picture">
+                  <pic:nvPicPr>
+                    <pic:cNvPr id="0" name="Picture 3" descr="Han Park - Steampunk Zombie"/>
+                    <pic:cNvPicPr>
+                      <a:picLocks noChangeAspect="1" noChangeArrowheads="1"/>
+                    </pic:cNvPicPr>
+                  </pic:nvPicPr>
+                  <pic:blipFill>
+                    <a:blip r:embed="rId7" cstate="print">
+                      <a:extLst>
+                        <a:ext uri="{28A0092B-C50C-407E-A947-70E740481C1C}">
+                          <a14:useLocalDpi xmlns:a14="http://schemas.microsoft.com/office/drawing/2010/main" val="0"/>
+                        </a:ext>
+                      </a:extLst>
+                    </a:blip>
+                    <a:srcRect/>
+                    <a:stretch>
+                      <a:fillRect/>
+                    </a:stretch>
+                  </pic:blipFill>
+                  <pic:spPr bwMode="auto">
+                    <a:xfrm>
+                      <a:off x="0" y="0"/>
+                      <a:ext cx="1449294" cy="2640894"/>
+                    </a:xfrm>
+                    <a:prstGeom prst="rect">
+                      <a:avLst/>
+                    </a:prstGeom>
+                    <a:noFill/>
+                    <a:ln>
+                      <a:noFill/>
+                    </a:ln>
+                  </pic:spPr>
+                </pic:pic>
+              </a:graphicData>
+            </a:graphic>
+          </wp:inline>
+        </w:drawing>
+      </w:r>
+      <w:r>
+        <w:rPr>
+          <w:noProof/>
+        </w:rPr>
+        <w:drawing>
+          <wp:inline distT="0" distB="0" distL="0" distR="0" wp14:anchorId="7ACBD281" wp14:editId="724C7942">
+            <wp:extent cx="1696561" cy="1822988"/>
+            <wp:effectExtent l="0" t="0" r="0" b="6350"/>
+            <wp:docPr id="1166507322" name="Grafik 4" descr="4,9 Tausend Zombie Science lizenzfreie Bilder, Stockfotos und Aufnahmen |  Shutterstock"/>
+            <wp:cNvGraphicFramePr>
+              <a:graphicFrameLocks xmlns:a="http://schemas.openxmlformats.org/drawingml/2006/main" noChangeAspect="1"/>
+            </wp:cNvGraphicFramePr>
+            <a:graphic xmlns:a="http://schemas.openxmlformats.org/drawingml/2006/main">
+              <a:graphicData uri="http://schemas.openxmlformats.org/drawingml/2006/picture">
+                <pic:pic xmlns:pic="http://schemas.openxmlformats.org/drawingml/2006/picture">
+                  <pic:nvPicPr>
+                    <pic:cNvPr id="0" name="Picture 5" descr="4,9 Tausend Zombie Science lizenzfreie Bilder, Stockfotos und Aufnahmen |  Shutterstock"/>
+                    <pic:cNvPicPr>
+                      <a:picLocks noChangeAspect="1" noChangeArrowheads="1"/>
+                    </pic:cNvPicPr>
+                  </pic:nvPicPr>
+                  <pic:blipFill>
+                    <a:blip r:embed="rId8">
+                      <a:extLst>
+                        <a:ext uri="{28A0092B-C50C-407E-A947-70E740481C1C}">
+                          <a14:useLocalDpi xmlns:a14="http://schemas.microsoft.com/office/drawing/2010/main" val="0"/>
+                        </a:ext>
+                      </a:extLst>
+                    </a:blip>
+                    <a:srcRect/>
+                    <a:stretch>
+                      <a:fillRect/>
+                    </a:stretch>
+                  </pic:blipFill>
+                  <pic:spPr bwMode="auto">
+                    <a:xfrm>
+                      <a:off x="0" y="0"/>
+                      <a:ext cx="1700566" cy="1827291"/>
+                    </a:xfrm>
+                    <a:prstGeom prst="rect">
+                      <a:avLst/>
+                    </a:prstGeom>
+                    <a:noFill/>
+                    <a:ln>
+                      <a:noFill/>
+                    </a:ln>
+                  </pic:spPr>
+                </pic:pic>
+              </a:graphicData>
+            </a:graphic>
+          </wp:inline>
+        </w:drawing>
+      </w:r>
+      <w:r>
+        <w:rPr>
+          <w:noProof/>
+        </w:rPr>
+        <w:drawing>
+          <wp:inline distT="0" distB="0" distL="0" distR="0" wp14:anchorId="6C00E955" wp14:editId="4A3E5AF8">
+            <wp:extent cx="1749875" cy="1312697"/>
+            <wp:effectExtent l="0" t="0" r="3175" b="1905"/>
+            <wp:docPr id="375881072" name="Grafik 5" descr="1911 Nickel Plated – Carbon Steel Frame – 1911 Pistols For Sale"/>
+            <wp:cNvGraphicFramePr>
+              <a:graphicFrameLocks xmlns:a="http://schemas.openxmlformats.org/drawingml/2006/main" noChangeAspect="1"/>
+            </wp:cNvGraphicFramePr>
+            <a:graphic xmlns:a="http://schemas.openxmlformats.org/drawingml/2006/main">
+              <a:graphicData uri="http://schemas.openxmlformats.org/drawingml/2006/picture">
+                <pic:pic xmlns:pic="http://schemas.openxmlformats.org/drawingml/2006/picture">
+                  <pic:nvPicPr>
+                    <pic:cNvPr id="0" name="Picture 7" descr="1911 Nickel Plated – Carbon Steel Frame – 1911 Pistols For Sale"/>
+                    <pic:cNvPicPr>
+                      <a:picLocks noChangeAspect="1" noChangeArrowheads="1"/>
+                    </pic:cNvPicPr>
+                  </pic:nvPicPr>
+                  <pic:blipFill>
+                    <a:blip r:embed="rId9" cstate="print">
+                      <a:extLst>
+                        <a:ext uri="{28A0092B-C50C-407E-A947-70E740481C1C}">
+                          <a14:useLocalDpi xmlns:a14="http://schemas.microsoft.com/office/drawing/2010/main" val="0"/>
+                        </a:ext>
+                      </a:extLst>
+                    </a:blip>
+                    <a:srcRect/>
+                    <a:stretch>
+                      <a:fillRect/>
+                    </a:stretch>
+                  </pic:blipFill>
+                  <pic:spPr bwMode="auto">
+                    <a:xfrm>
+                      <a:off x="0" y="0"/>
+                      <a:ext cx="1754972" cy="1316521"/>
+                    </a:xfrm>
+                    <a:prstGeom prst="rect">
+                      <a:avLst/>
+                    </a:prstGeom>
+                    <a:noFill/>
+                    <a:ln>
+                      <a:noFill/>
+                    </a:ln>
+                  </pic:spPr>
+                </pic:pic>
+              </a:graphicData>
+            </a:graphic>
+          </wp:inline>
+        </w:drawing>
+      </w:r>
+    </w:p>
+    <w:p>
+      <w:pPr>
+        <w:rPr>
+          <w:rFonts w:ascii="OCR A Extended" w:hAnsi="OCR A Extended" w:cs="Centaur Now Display"/>
+          <w:sz w:val="36"/>
+          <w:szCs w:val="36"/>
+          <w:lang w:val="de-DE"/>
+        </w:rPr>
+      </w:pPr>
+      <w:r>
+        <w:rPr>
+          <w:noProof/>
+        </w:rPr>
+        <w:drawing>
+          <wp:inline distT="0" distB="0" distL="0" distR="0" wp14:anchorId="66AB1B48" wp14:editId="2CBC2E06">
+            <wp:extent cx="2801931" cy="1576358"/>
+            <wp:effectExtent l="0" t="0" r="0" b="5080"/>
+            <wp:docPr id="1092796491" name="Grafik 6" descr="Steampunk Clock Factory | Cosmos by Leartes"/>
+            <wp:cNvGraphicFramePr>
+              <a:graphicFrameLocks xmlns:a="http://schemas.openxmlformats.org/drawingml/2006/main" noChangeAspect="1"/>
+            </wp:cNvGraphicFramePr>
+            <a:graphic xmlns:a="http://schemas.openxmlformats.org/drawingml/2006/main">
+              <a:graphicData uri="http://schemas.openxmlformats.org/drawingml/2006/picture">
+                <pic:pic xmlns:pic="http://schemas.openxmlformats.org/drawingml/2006/picture">
+                  <pic:nvPicPr>
+                    <pic:cNvPr id="0" name="Picture 9" descr="Steampunk Clock Factory | Cosmos by Leartes"/>
+                    <pic:cNvPicPr>
+                      <a:picLocks noChangeAspect="1" noChangeArrowheads="1"/>
+                    </pic:cNvPicPr>
+                  </pic:nvPicPr>
+                  <pic:blipFill>
+                    <a:blip r:embed="rId10" cstate="print">
+                      <a:extLst>
+                        <a:ext uri="{28A0092B-C50C-407E-A947-70E740481C1C}">
+                          <a14:useLocalDpi xmlns:a14="http://schemas.microsoft.com/office/drawing/2010/main" val="0"/>
+                        </a:ext>
+                      </a:extLst>
+                    </a:blip>
+                    <a:srcRect/>
+                    <a:stretch>
+                      <a:fillRect/>
+                    </a:stretch>
+                  </pic:blipFill>
+                  <pic:spPr bwMode="auto">
+                    <a:xfrm>
+                      <a:off x="0" y="0"/>
+                      <a:ext cx="2806365" cy="1578852"/>
+                    </a:xfrm>
+                    <a:prstGeom prst="rect">
+                      <a:avLst/>
+                    </a:prstGeom>
+                    <a:noFill/>
+                    <a:ln>
+                      <a:noFill/>
+                    </a:ln>
+                  </pic:spPr>
+                </pic:pic>
+              </a:graphicData>
+            </a:graphic>
+          </wp:inline>
+        </w:drawing>
+      </w:r>
+      <w:r>
+        <w:rPr>
+          <w:noProof/>
+        </w:rPr>
+        <w:drawing>
+          <wp:inline distT="0" distB="0" distL="0" distR="0" wp14:anchorId="5560FB06" wp14:editId="63CA5DD1">
+            <wp:extent cx="2580640" cy="1772920"/>
+            <wp:effectExtent l="0" t="0" r="0" b="0"/>
+            <wp:docPr id="1748882516" name="Grafik 7" descr="Wallpaper field, sunset, nature, golden, field, nature, sunset for mobile  and desktop, section пейзажи, resolution 5232x3584 - download"/>
+            <wp:cNvGraphicFramePr>
+              <a:graphicFrameLocks xmlns:a="http://schemas.openxmlformats.org/drawingml/2006/main" noChangeAspect="1"/>
+            </wp:cNvGraphicFramePr>
+            <a:graphic xmlns:a="http://schemas.openxmlformats.org/drawingml/2006/main">
+              <a:graphicData uri="http://schemas.openxmlformats.org/drawingml/2006/picture">
+                <pic:pic xmlns:pic="http://schemas.openxmlformats.org/drawingml/2006/picture">
+                  <pic:nvPicPr>
+                    <pic:cNvPr id="0" name="Picture 11" descr="Wallpaper field, sunset, nature, golden, field, nature, sunset for mobile  and desktop, section пейзажи, resolution 5232x3584 - download"/>
+                    <pic:cNvPicPr>
+                      <a:picLocks noChangeAspect="1" noChangeArrowheads="1"/>
+                    </pic:cNvPicPr>
+                  </pic:nvPicPr>
+                  <pic:blipFill>
+                    <a:blip r:embed="rId11">
+                      <a:extLst>
+                        <a:ext uri="{28A0092B-C50C-407E-A947-70E740481C1C}">
+                          <a14:useLocalDpi xmlns:a14="http://schemas.microsoft.com/office/drawing/2010/main" val="0"/>
+                        </a:ext>
+                      </a:extLst>
+                    </a:blip>
+                    <a:srcRect/>
+                    <a:stretch>
+                      <a:fillRect/>
+                    </a:stretch>
+                  </pic:blipFill>
+                  <pic:spPr bwMode="auto">
+                    <a:xfrm>
+                      <a:off x="0" y="0"/>
+                      <a:ext cx="2580640" cy="1772920"/>
+                    </a:xfrm>
+                    <a:prstGeom prst="rect">
+                      <a:avLst/>
+                    </a:prstGeom>
+                    <a:noFill/>
+                    <a:ln>
+                      <a:noFill/>
+                    </a:ln>
+                  </pic:spPr>
+                </pic:pic>
+              </a:graphicData>
+            </a:graphic>
+          </wp:inline>
+        </w:drawing>
+      </w:r>
     </w:p>
     <w:sectPr>
       <w:pgSz w:w="11906" w:h="16838"/>
@@ -859,15 +1542,15 @@
     <w:lsdException w:name="Unresolved Mention" w:semiHidden="1" w:unhideWhenUsed="1"/>
     <w:lsdException w:name="Smart Link" w:semiHidden="1" w:unhideWhenUsed="1"/>
   </w:latentStyles>
-  <w:style w:type="paragraph" w:default="1" w:styleId="Normal">
+  <w:style w:type="paragraph" w:default="1" w:styleId="Standard">
     <w:name w:val="Normal"/>
     <w:qFormat/>
   </w:style>
-  <w:style w:type="paragraph" w:styleId="Heading1">
+  <w:style w:type="paragraph" w:styleId="berschrift1">
     <w:name w:val="heading 1"/>
-    <w:basedOn w:val="Normal"/>
-    <w:next w:val="Normal"/>
-    <w:link w:val="Heading1Char"/>
+    <w:basedOn w:val="Standard"/>
+    <w:next w:val="Standard"/>
+    <w:link w:val="berschrift1Zchn"/>
     <w:uiPriority w:val="9"/>
     <w:qFormat/>
     <w:rsid w:val="00066146"/>
@@ -884,11 +1567,11 @@
       <w:szCs w:val="40"/>
     </w:rPr>
   </w:style>
-  <w:style w:type="paragraph" w:styleId="Heading2">
+  <w:style w:type="paragraph" w:styleId="berschrift2">
     <w:name w:val="heading 2"/>
-    <w:basedOn w:val="Normal"/>
-    <w:next w:val="Normal"/>
-    <w:link w:val="Heading2Char"/>
+    <w:basedOn w:val="Standard"/>
+    <w:next w:val="Standard"/>
+    <w:link w:val="berschrift2Zchn"/>
     <w:uiPriority w:val="9"/>
     <w:semiHidden/>
     <w:unhideWhenUsed/>
@@ -907,11 +1590,11 @@
       <w:szCs w:val="32"/>
     </w:rPr>
   </w:style>
-  <w:style w:type="paragraph" w:styleId="Heading3">
+  <w:style w:type="paragraph" w:styleId="berschrift3">
     <w:name w:val="heading 3"/>
-    <w:basedOn w:val="Normal"/>
-    <w:next w:val="Normal"/>
-    <w:link w:val="Heading3Char"/>
+    <w:basedOn w:val="Standard"/>
+    <w:next w:val="Standard"/>
+    <w:link w:val="berschrift3Zchn"/>
     <w:uiPriority w:val="9"/>
     <w:semiHidden/>
     <w:unhideWhenUsed/>
@@ -930,11 +1613,11 @@
       <w:szCs w:val="28"/>
     </w:rPr>
   </w:style>
-  <w:style w:type="paragraph" w:styleId="Heading4">
+  <w:style w:type="paragraph" w:styleId="berschrift4">
     <w:name w:val="heading 4"/>
-    <w:basedOn w:val="Normal"/>
-    <w:next w:val="Normal"/>
-    <w:link w:val="Heading4Char"/>
+    <w:basedOn w:val="Standard"/>
+    <w:next w:val="Standard"/>
+    <w:link w:val="berschrift4Zchn"/>
     <w:uiPriority w:val="9"/>
     <w:semiHidden/>
     <w:unhideWhenUsed/>
@@ -953,11 +1636,11 @@
       <w:color w:val="0F4761" w:themeColor="accent1" w:themeShade="BF"/>
     </w:rPr>
   </w:style>
-  <w:style w:type="paragraph" w:styleId="Heading5">
+  <w:style w:type="paragraph" w:styleId="berschrift5">
     <w:name w:val="heading 5"/>
-    <w:basedOn w:val="Normal"/>
-    <w:next w:val="Normal"/>
-    <w:link w:val="Heading5Char"/>
+    <w:basedOn w:val="Standard"/>
+    <w:next w:val="Standard"/>
+    <w:link w:val="berschrift5Zchn"/>
     <w:uiPriority w:val="9"/>
     <w:semiHidden/>
     <w:unhideWhenUsed/>
@@ -974,11 +1657,11 @@
       <w:color w:val="0F4761" w:themeColor="accent1" w:themeShade="BF"/>
     </w:rPr>
   </w:style>
-  <w:style w:type="paragraph" w:styleId="Heading6">
+  <w:style w:type="paragraph" w:styleId="berschrift6">
     <w:name w:val="heading 6"/>
-    <w:basedOn w:val="Normal"/>
-    <w:next w:val="Normal"/>
-    <w:link w:val="Heading6Char"/>
+    <w:basedOn w:val="Standard"/>
+    <w:next w:val="Standard"/>
+    <w:link w:val="berschrift6Zchn"/>
     <w:uiPriority w:val="9"/>
     <w:semiHidden/>
     <w:unhideWhenUsed/>
@@ -997,11 +1680,11 @@
       <w:color w:val="595959" w:themeColor="text1" w:themeTint="A6"/>
     </w:rPr>
   </w:style>
-  <w:style w:type="paragraph" w:styleId="Heading7">
+  <w:style w:type="paragraph" w:styleId="berschrift7">
     <w:name w:val="heading 7"/>
-    <w:basedOn w:val="Normal"/>
-    <w:next w:val="Normal"/>
-    <w:link w:val="Heading7Char"/>
+    <w:basedOn w:val="Standard"/>
+    <w:next w:val="Standard"/>
+    <w:link w:val="berschrift7Zchn"/>
     <w:uiPriority w:val="9"/>
     <w:semiHidden/>
     <w:unhideWhenUsed/>
@@ -1018,11 +1701,11 @@
       <w:color w:val="595959" w:themeColor="text1" w:themeTint="A6"/>
     </w:rPr>
   </w:style>
-  <w:style w:type="paragraph" w:styleId="Heading8">
+  <w:style w:type="paragraph" w:styleId="berschrift8">
     <w:name w:val="heading 8"/>
-    <w:basedOn w:val="Normal"/>
-    <w:next w:val="Normal"/>
-    <w:link w:val="Heading8Char"/>
+    <w:basedOn w:val="Standard"/>
+    <w:next w:val="Standard"/>
+    <w:link w:val="berschrift8Zchn"/>
     <w:uiPriority w:val="9"/>
     <w:semiHidden/>
     <w:unhideWhenUsed/>
@@ -1041,11 +1724,11 @@
       <w:color w:val="272727" w:themeColor="text1" w:themeTint="D8"/>
     </w:rPr>
   </w:style>
-  <w:style w:type="paragraph" w:styleId="Heading9">
+  <w:style w:type="paragraph" w:styleId="berschrift9">
     <w:name w:val="heading 9"/>
-    <w:basedOn w:val="Normal"/>
-    <w:next w:val="Normal"/>
-    <w:link w:val="Heading9Char"/>
+    <w:basedOn w:val="Standard"/>
+    <w:next w:val="Standard"/>
+    <w:link w:val="berschrift9Zchn"/>
     <w:uiPriority w:val="9"/>
     <w:semiHidden/>
     <w:unhideWhenUsed/>
@@ -1062,13 +1745,13 @@
       <w:color w:val="272727" w:themeColor="text1" w:themeTint="D8"/>
     </w:rPr>
   </w:style>
-  <w:style w:type="character" w:default="1" w:styleId="DefaultParagraphFont">
+  <w:style w:type="character" w:default="1" w:styleId="Absatz-Standardschriftart">
     <w:name w:val="Default Paragraph Font"/>
     <w:uiPriority w:val="1"/>
     <w:semiHidden/>
     <w:unhideWhenUsed/>
   </w:style>
-  <w:style w:type="table" w:default="1" w:styleId="TableNormal">
+  <w:style w:type="table" w:default="1" w:styleId="NormaleTabelle">
     <w:name w:val="Normal Table"/>
     <w:uiPriority w:val="99"/>
     <w:semiHidden/>
@@ -1083,16 +1766,16 @@
       </w:tblCellMar>
     </w:tblPr>
   </w:style>
-  <w:style w:type="numbering" w:default="1" w:styleId="NoList">
+  <w:style w:type="numbering" w:default="1" w:styleId="KeineListe">
     <w:name w:val="No List"/>
     <w:uiPriority w:val="99"/>
     <w:semiHidden/>
     <w:unhideWhenUsed/>
   </w:style>
-  <w:style w:type="character" w:customStyle="1" w:styleId="Heading1Char">
-    <w:name w:val="Heading 1 Char"/>
-    <w:basedOn w:val="DefaultParagraphFont"/>
-    <w:link w:val="Heading1"/>
+  <w:style w:type="character" w:customStyle="1" w:styleId="berschrift1Zchn">
+    <w:name w:val="Überschrift 1 Zchn"/>
+    <w:basedOn w:val="Absatz-Standardschriftart"/>
+    <w:link w:val="berschrift1"/>
     <w:uiPriority w:val="9"/>
     <w:rsid w:val="00066146"/>
     <w:rPr>
@@ -1102,10 +1785,10 @@
       <w:szCs w:val="40"/>
     </w:rPr>
   </w:style>
-  <w:style w:type="character" w:customStyle="1" w:styleId="Heading2Char">
-    <w:name w:val="Heading 2 Char"/>
-    <w:basedOn w:val="DefaultParagraphFont"/>
-    <w:link w:val="Heading2"/>
+  <w:style w:type="character" w:customStyle="1" w:styleId="berschrift2Zchn">
+    <w:name w:val="Überschrift 2 Zchn"/>
+    <w:basedOn w:val="Absatz-Standardschriftart"/>
+    <w:link w:val="berschrift2"/>
     <w:uiPriority w:val="9"/>
     <w:semiHidden/>
     <w:rsid w:val="00066146"/>
@@ -1116,10 +1799,10 @@
       <w:szCs w:val="32"/>
     </w:rPr>
   </w:style>
-  <w:style w:type="character" w:customStyle="1" w:styleId="Heading3Char">
-    <w:name w:val="Heading 3 Char"/>
-    <w:basedOn w:val="DefaultParagraphFont"/>
-    <w:link w:val="Heading3"/>
+  <w:style w:type="character" w:customStyle="1" w:styleId="berschrift3Zchn">
+    <w:name w:val="Überschrift 3 Zchn"/>
+    <w:basedOn w:val="Absatz-Standardschriftart"/>
+    <w:link w:val="berschrift3"/>
     <w:uiPriority w:val="9"/>
     <w:semiHidden/>
     <w:rsid w:val="00066146"/>
@@ -1130,10 +1813,10 @@
       <w:szCs w:val="28"/>
     </w:rPr>
   </w:style>
-  <w:style w:type="character" w:customStyle="1" w:styleId="Heading4Char">
-    <w:name w:val="Heading 4 Char"/>
-    <w:basedOn w:val="DefaultParagraphFont"/>
-    <w:link w:val="Heading4"/>
+  <w:style w:type="character" w:customStyle="1" w:styleId="berschrift4Zchn">
+    <w:name w:val="Überschrift 4 Zchn"/>
+    <w:basedOn w:val="Absatz-Standardschriftart"/>
+    <w:link w:val="berschrift4"/>
     <w:uiPriority w:val="9"/>
     <w:semiHidden/>
     <w:rsid w:val="00066146"/>
@@ -1144,10 +1827,10 @@
       <w:color w:val="0F4761" w:themeColor="accent1" w:themeShade="BF"/>
     </w:rPr>
   </w:style>
-  <w:style w:type="character" w:customStyle="1" w:styleId="Heading5Char">
-    <w:name w:val="Heading 5 Char"/>
-    <w:basedOn w:val="DefaultParagraphFont"/>
-    <w:link w:val="Heading5"/>
+  <w:style w:type="character" w:customStyle="1" w:styleId="berschrift5Zchn">
+    <w:name w:val="Überschrift 5 Zchn"/>
+    <w:basedOn w:val="Absatz-Standardschriftart"/>
+    <w:link w:val="berschrift5"/>
     <w:uiPriority w:val="9"/>
     <w:semiHidden/>
     <w:rsid w:val="00066146"/>
@@ -1156,10 +1839,10 @@
       <w:color w:val="0F4761" w:themeColor="accent1" w:themeShade="BF"/>
     </w:rPr>
   </w:style>
-  <w:style w:type="character" w:customStyle="1" w:styleId="Heading6Char">
-    <w:name w:val="Heading 6 Char"/>
-    <w:basedOn w:val="DefaultParagraphFont"/>
-    <w:link w:val="Heading6"/>
+  <w:style w:type="character" w:customStyle="1" w:styleId="berschrift6Zchn">
+    <w:name w:val="Überschrift 6 Zchn"/>
+    <w:basedOn w:val="Absatz-Standardschriftart"/>
+    <w:link w:val="berschrift6"/>
     <w:uiPriority w:val="9"/>
     <w:semiHidden/>
     <w:rsid w:val="00066146"/>
@@ -1170,10 +1853,10 @@
       <w:color w:val="595959" w:themeColor="text1" w:themeTint="A6"/>
     </w:rPr>
   </w:style>
-  <w:style w:type="character" w:customStyle="1" w:styleId="Heading7Char">
-    <w:name w:val="Heading 7 Char"/>
-    <w:basedOn w:val="DefaultParagraphFont"/>
-    <w:link w:val="Heading7"/>
+  <w:style w:type="character" w:customStyle="1" w:styleId="berschrift7Zchn">
+    <w:name w:val="Überschrift 7 Zchn"/>
+    <w:basedOn w:val="Absatz-Standardschriftart"/>
+    <w:link w:val="berschrift7"/>
     <w:uiPriority w:val="9"/>
     <w:semiHidden/>
     <w:rsid w:val="00066146"/>
@@ -1182,10 +1865,10 @@
       <w:color w:val="595959" w:themeColor="text1" w:themeTint="A6"/>
     </w:rPr>
   </w:style>
-  <w:style w:type="character" w:customStyle="1" w:styleId="Heading8Char">
-    <w:name w:val="Heading 8 Char"/>
-    <w:basedOn w:val="DefaultParagraphFont"/>
-    <w:link w:val="Heading8"/>
+  <w:style w:type="character" w:customStyle="1" w:styleId="berschrift8Zchn">
+    <w:name w:val="Überschrift 8 Zchn"/>
+    <w:basedOn w:val="Absatz-Standardschriftart"/>
+    <w:link w:val="berschrift8"/>
     <w:uiPriority w:val="9"/>
     <w:semiHidden/>
     <w:rsid w:val="00066146"/>
@@ -1196,10 +1879,10 @@
       <w:color w:val="272727" w:themeColor="text1" w:themeTint="D8"/>
     </w:rPr>
   </w:style>
-  <w:style w:type="character" w:customStyle="1" w:styleId="Heading9Char">
-    <w:name w:val="Heading 9 Char"/>
-    <w:basedOn w:val="DefaultParagraphFont"/>
-    <w:link w:val="Heading9"/>
+  <w:style w:type="character" w:customStyle="1" w:styleId="berschrift9Zchn">
+    <w:name w:val="Überschrift 9 Zchn"/>
+    <w:basedOn w:val="Absatz-Standardschriftart"/>
+    <w:link w:val="berschrift9"/>
     <w:uiPriority w:val="9"/>
     <w:semiHidden/>
     <w:rsid w:val="00066146"/>
@@ -1208,11 +1891,11 @@
       <w:color w:val="272727" w:themeColor="text1" w:themeTint="D8"/>
     </w:rPr>
   </w:style>
-  <w:style w:type="paragraph" w:styleId="Title">
+  <w:style w:type="paragraph" w:styleId="Titel">
     <w:name w:val="Title"/>
-    <w:basedOn w:val="Normal"/>
-    <w:next w:val="Normal"/>
-    <w:link w:val="TitleChar"/>
+    <w:basedOn w:val="Standard"/>
+    <w:next w:val="Standard"/>
+    <w:link w:val="TitelZchn"/>
     <w:uiPriority w:val="10"/>
     <w:qFormat/>
     <w:rsid w:val="00066146"/>
@@ -1228,10 +1911,10 @@
       <w:szCs w:val="56"/>
     </w:rPr>
   </w:style>
-  <w:style w:type="character" w:customStyle="1" w:styleId="TitleChar">
-    <w:name w:val="Title Char"/>
-    <w:basedOn w:val="DefaultParagraphFont"/>
-    <w:link w:val="Title"/>
+  <w:style w:type="character" w:customStyle="1" w:styleId="TitelZchn">
+    <w:name w:val="Titel Zchn"/>
+    <w:basedOn w:val="Absatz-Standardschriftart"/>
+    <w:link w:val="Titel"/>
     <w:uiPriority w:val="10"/>
     <w:rsid w:val="00066146"/>
     <w:rPr>
@@ -1242,11 +1925,11 @@
       <w:szCs w:val="56"/>
     </w:rPr>
   </w:style>
-  <w:style w:type="paragraph" w:styleId="Subtitle">
+  <w:style w:type="paragraph" w:styleId="Untertitel">
     <w:name w:val="Subtitle"/>
-    <w:basedOn w:val="Normal"/>
-    <w:next w:val="Normal"/>
-    <w:link w:val="SubtitleChar"/>
+    <w:basedOn w:val="Standard"/>
+    <w:next w:val="Standard"/>
+    <w:link w:val="UntertitelZchn"/>
     <w:uiPriority w:val="11"/>
     <w:qFormat/>
     <w:rsid w:val="00066146"/>
@@ -1263,10 +1946,10 @@
       <w:szCs w:val="28"/>
     </w:rPr>
   </w:style>
-  <w:style w:type="character" w:customStyle="1" w:styleId="SubtitleChar">
-    <w:name w:val="Subtitle Char"/>
-    <w:basedOn w:val="DefaultParagraphFont"/>
-    <w:link w:val="Subtitle"/>
+  <w:style w:type="character" w:customStyle="1" w:styleId="UntertitelZchn">
+    <w:name w:val="Untertitel Zchn"/>
+    <w:basedOn w:val="Absatz-Standardschriftart"/>
+    <w:link w:val="Untertitel"/>
     <w:uiPriority w:val="11"/>
     <w:rsid w:val="00066146"/>
     <w:rPr>
@@ -1277,11 +1960,11 @@
       <w:szCs w:val="28"/>
     </w:rPr>
   </w:style>
-  <w:style w:type="paragraph" w:styleId="Quote">
+  <w:style w:type="paragraph" w:styleId="Zitat">
     <w:name w:val="Quote"/>
-    <w:basedOn w:val="Normal"/>
-    <w:next w:val="Normal"/>
-    <w:link w:val="QuoteChar"/>
+    <w:basedOn w:val="Standard"/>
+    <w:next w:val="Standard"/>
+    <w:link w:val="ZitatZchn"/>
     <w:uiPriority w:val="29"/>
     <w:qFormat/>
     <w:rsid w:val="00066146"/>
@@ -1295,10 +1978,10 @@
       <w:color w:val="404040" w:themeColor="text1" w:themeTint="BF"/>
     </w:rPr>
   </w:style>
-  <w:style w:type="character" w:customStyle="1" w:styleId="QuoteChar">
-    <w:name w:val="Quote Char"/>
-    <w:basedOn w:val="DefaultParagraphFont"/>
-    <w:link w:val="Quote"/>
+  <w:style w:type="character" w:customStyle="1" w:styleId="ZitatZchn">
+    <w:name w:val="Zitat Zchn"/>
+    <w:basedOn w:val="Absatz-Standardschriftart"/>
+    <w:link w:val="Zitat"/>
     <w:uiPriority w:val="29"/>
     <w:rsid w:val="00066146"/>
     <w:rPr>
@@ -1307,9 +1990,9 @@
       <w:color w:val="404040" w:themeColor="text1" w:themeTint="BF"/>
     </w:rPr>
   </w:style>
-  <w:style w:type="paragraph" w:styleId="ListParagraph">
+  <w:style w:type="paragraph" w:styleId="Listenabsatz">
     <w:name w:val="List Paragraph"/>
-    <w:basedOn w:val="Normal"/>
+    <w:basedOn w:val="Standard"/>
     <w:uiPriority w:val="34"/>
     <w:qFormat/>
     <w:rsid w:val="00066146"/>
@@ -1318,9 +2001,9 @@
       <w:contextualSpacing/>
     </w:pPr>
   </w:style>
-  <w:style w:type="character" w:styleId="IntenseEmphasis">
+  <w:style w:type="character" w:styleId="IntensiveHervorhebung">
     <w:name w:val="Intense Emphasis"/>
-    <w:basedOn w:val="DefaultParagraphFont"/>
+    <w:basedOn w:val="Absatz-Standardschriftart"/>
     <w:uiPriority w:val="21"/>
     <w:qFormat/>
     <w:rsid w:val="00066146"/>
@@ -1330,11 +2013,11 @@
       <w:color w:val="0F4761" w:themeColor="accent1" w:themeShade="BF"/>
     </w:rPr>
   </w:style>
-  <w:style w:type="paragraph" w:styleId="IntenseQuote">
+  <w:style w:type="paragraph" w:styleId="IntensivesZitat">
     <w:name w:val="Intense Quote"/>
-    <w:basedOn w:val="Normal"/>
-    <w:next w:val="Normal"/>
-    <w:link w:val="IntenseQuoteChar"/>
+    <w:basedOn w:val="Standard"/>
+    <w:next w:val="Standard"/>
+    <w:link w:val="IntensivesZitatZchn"/>
     <w:uiPriority w:val="30"/>
     <w:qFormat/>
     <w:rsid w:val="00066146"/>
@@ -1353,10 +2036,10 @@
       <w:color w:val="0F4761" w:themeColor="accent1" w:themeShade="BF"/>
     </w:rPr>
   </w:style>
-  <w:style w:type="character" w:customStyle="1" w:styleId="IntenseQuoteChar">
-    <w:name w:val="Intense Quote Char"/>
-    <w:basedOn w:val="DefaultParagraphFont"/>
-    <w:link w:val="IntenseQuote"/>
+  <w:style w:type="character" w:customStyle="1" w:styleId="IntensivesZitatZchn">
+    <w:name w:val="Intensives Zitat Zchn"/>
+    <w:basedOn w:val="Absatz-Standardschriftart"/>
+    <w:link w:val="IntensivesZitat"/>
     <w:uiPriority w:val="30"/>
     <w:rsid w:val="00066146"/>
     <w:rPr>
@@ -1365,9 +2048,9 @@
       <w:color w:val="0F4761" w:themeColor="accent1" w:themeShade="BF"/>
     </w:rPr>
   </w:style>
-  <w:style w:type="character" w:styleId="IntenseReference">
+  <w:style w:type="character" w:styleId="IntensiverVerweis">
     <w:name w:val="Intense Reference"/>
-    <w:basedOn w:val="DefaultParagraphFont"/>
+    <w:basedOn w:val="Absatz-Standardschriftart"/>
     <w:uiPriority w:val="32"/>
     <w:qFormat/>
     <w:rsid w:val="00066146"/>
@@ -1377,6 +2060,29 @@
       <w:smallCaps/>
       <w:color w:val="0F4761" w:themeColor="accent1" w:themeShade="BF"/>
       <w:spacing w:val="5"/>
+    </w:rPr>
+  </w:style>
+  <w:style w:type="character" w:styleId="Hyperlink">
+    <w:name w:val="Hyperlink"/>
+    <w:basedOn w:val="Absatz-Standardschriftart"/>
+    <w:uiPriority w:val="99"/>
+    <w:unhideWhenUsed/>
+    <w:rsid w:val="0066415C"/>
+    <w:rPr>
+      <w:color w:val="467886" w:themeColor="hyperlink"/>
+      <w:u w:val="single"/>
+    </w:rPr>
+  </w:style>
+  <w:style w:type="character" w:styleId="NichtaufgelsteErwhnung">
+    <w:name w:val="Unresolved Mention"/>
+    <w:basedOn w:val="Absatz-Standardschriftart"/>
+    <w:uiPriority w:val="99"/>
+    <w:semiHidden/>
+    <w:unhideWhenUsed/>
+    <w:rsid w:val="0066415C"/>
+    <w:rPr>
+      <w:color w:val="605E5C"/>
+      <w:shd w:val="clear" w:color="auto" w:fill="E1DFDD"/>
     </w:rPr>
   </w:style>
 </w:styles>

</xml_diff>